<commit_message>
final status of 2025 docs
</commit_message>
<xml_diff>
--- a/reference.docx
+++ b/reference.docx
@@ -4,13 +4,27 @@
   <w:body>
     <w:p>
       <w:pPr>
+        <w:pStyle w:val="currentstatus"/>
+        <w:spacing w:before="180" w:after="180"/>
+        <w:rPr/>
+      </w:pPr>
+      <w:r>
+        <w:rPr>
+          <w:rStyle w:val="currentstatuslabel"/>
+        </w:rPr>
+        <w:t>CURRENT STATUS:</w:t>
+      </w:r>
+      <w:r>
+        <w:rPr/>
+        <w:t xml:space="preserve"> Tournament starts Saturday.</w:t>
+      </w:r>
+    </w:p>
+    <w:p>
+      <w:pPr>
         <w:pStyle w:val="Heading1"/>
-        <w:keepNext w:val="true"/>
-        <w:keepLines/>
         <w:spacing w:before="480" w:after="0"/>
         <w:rPr/>
       </w:pPr>
-      <w:bookmarkStart w:id="0" w:name="title"/>
       <w:r>
         <w:rPr/>
         <w:t>Title</w:t>
@@ -21,7 +35,6 @@
         <w:pStyle w:val="Heading2"/>
         <w:rPr/>
       </w:pPr>
-      <w:bookmarkStart w:id="1" w:name="title-2"/>
       <w:r>
         <w:rPr/>
         <w:t>Title 2</w:t>
@@ -32,7 +45,6 @@
         <w:pStyle w:val="Heading3"/>
         <w:rPr/>
       </w:pPr>
-      <w:bookmarkStart w:id="2" w:name="title-3"/>
       <w:r>
         <w:rPr/>
         <w:t>Title 3</w:t>
@@ -44,16 +56,16 @@
         <w:spacing w:before="180" w:after="180"/>
         <w:rPr/>
       </w:pPr>
-      <w:bookmarkStart w:id="3" w:name="title"/>
-      <w:bookmarkStart w:id="4" w:name="title-2"/>
-      <w:bookmarkStart w:id="5" w:name="title-3"/>
+      <w:bookmarkStart w:id="0" w:name="title-3"/>
+      <w:bookmarkStart w:id="1" w:name="title-2"/>
+      <w:bookmarkStart w:id="2" w:name="title"/>
       <w:r>
         <w:rPr/>
         <w:t>Lorem ipsum dolor sit amet…</w:t>
       </w:r>
-      <w:bookmarkEnd w:id="3"/>
-      <w:bookmarkEnd w:id="4"/>
-      <w:bookmarkEnd w:id="5"/>
+      <w:bookmarkEnd w:id="0"/>
+      <w:bookmarkEnd w:id="1"/>
+      <w:bookmarkEnd w:id="2"/>
     </w:p>
     <w:sectPr>
       <w:type w:val="nextPage"/>
@@ -91,6 +103,7 @@
     <w:qFormat/>
     <w:pPr>
       <w:widowControl/>
+      <w:suppressAutoHyphens w:val="true"/>
       <w:bidi w:val="0"/>
       <w:spacing w:before="0" w:after="200"/>
       <w:jc w:val="left"/>
@@ -322,7 +335,6 @@
   </w:style>
   <w:style w:type="character" w:styleId="FootnoteCharacters">
     <w:name w:val="Footnote Characters"/>
-    <w:basedOn w:val="BodyTextChar"/>
     <w:qFormat/>
     <w:rPr>
       <w:vertAlign w:val="superscript"/>
@@ -595,6 +607,12 @@
   <w:style w:type="character" w:styleId="NormalTok" w:customStyle="1">
     <w:name w:val="NormalTok"/>
     <w:basedOn w:val="VerbatimChar"/>
+    <w:qFormat/>
+    <w:rPr/>
+  </w:style>
+  <w:style w:type="character" w:styleId="currentstatuslabel">
+    <w:name w:val="current_status_label"/>
+    <w:basedOn w:val="BodyTextChar"/>
     <w:qFormat/>
     <w:rPr/>
   </w:style>
@@ -717,6 +735,7 @@
       <w:keepNext w:val="true"/>
       <w:keepLines/>
       <w:widowControl/>
+      <w:suppressAutoHyphens w:val="true"/>
       <w:bidi w:val="0"/>
       <w:spacing w:before="0" w:after="200"/>
       <w:jc w:val="center"/>
@@ -738,6 +757,7 @@
       <w:keepNext w:val="true"/>
       <w:keepLines/>
       <w:widowControl/>
+      <w:suppressAutoHyphens w:val="true"/>
       <w:bidi w:val="0"/>
       <w:spacing w:before="0" w:after="200"/>
       <w:jc w:val="center"/>
@@ -820,6 +840,7 @@
     <w:qFormat/>
     <w:pPr>
       <w:widowControl/>
+      <w:suppressAutoHyphens w:val="true"/>
       <w:bidi w:val="0"/>
       <w:spacing w:before="100" w:after="100"/>
       <w:ind w:hanging="0" w:left="480" w:right="480"/>
@@ -918,6 +939,20 @@
     <w:qFormat/>
     <w:pPr/>
     <w:rPr/>
+  </w:style>
+  <w:style w:type="paragraph" w:styleId="currentstatus">
+    <w:name w:val="current_status"/>
+    <w:basedOn w:val="BodyText"/>
+    <w:qFormat/>
+    <w:pPr>
+      <w:pBdr/>
+      <w:shd w:fill="000000" w:val="clear"/>
+      <w:spacing w:lineRule="auto" w:line="240"/>
+    </w:pPr>
+    <w:rPr>
+      <w:color w:val="FF00FF"/>
+      <w:shd w:fill="auto" w:val="clear"/>
+    </w:rPr>
   </w:style>
   <w:style w:type="table" w:default="1" w:styleId="Table">
     <w:name w:val="Table"/>

</xml_diff>